<commit_message>
Fix portfolio copy errors and correct salon location in resumes
- Hero stat: "350+" -> "~350" real assignments validated
- Replace unlinked "GitHub Repository Data Analysis" item with the
  supervised-learning project and link its new repo
- Drop the offline-demo sentence from the E-Commerce item
- Download Resume copy now matches the single resume offered
- Reorder Selected Work: DataChat before Spam Tool Kit
- Resumes: 79 Nails & Hair is in Fullerton, not Garden Grove (tex + rebuilt PDFs)
- Remove the GitHub Repository Data Analysis entry from three docx resumes

Co-Authored-By: Claude Opus 5.5 <noreply@anthropic.com>
</commit_message>
<xml_diff>
--- a/public/resumes/Finn-Nguyen-Resume-AI-ML-Engineer.docx
+++ b/public/resumes/Finn-Nguyen-Resume-AI-ML-Engineer.docx
@@ -449,52 +449,6 @@
           <w:szCs w:val="19"/>
         </w:rPr>
         <w:t xml:space="preserve">Developed a computer-vision application for face detection and identification using OpenCV and the face_recognition library.</w:t>
-      </w:r>
-    </w:p>
-    <w:p>
-      <w:pPr>
-        <w:spacing w:after="20" w:before="100"/>
-      </w:pPr>
-      <w:r>
-        <w:rPr>
-          <w:rFonts w:ascii="Calibri" w:cs="Calibri" w:eastAsia="Calibri" w:hAnsi="Calibri"/>
-          <w:b/>
-          <w:bCs/>
-          <w:color w:val="222222"/>
-          <w:sz w:val="20"/>
-          <w:szCs w:val="20"/>
-        </w:rPr>
-        <w:t xml:space="preserve">GitHub Repository Data Analysis — Personal Project</w:t>
-      </w:r>
-      <w:r>
-        <w:rPr>
-          <w:rFonts w:ascii="Calibri" w:cs="Calibri" w:eastAsia="Calibri" w:hAnsi="Calibri"/>
-          <w:i/>
-          <w:iCs/>
-          <w:color w:val="555555"/>
-          <w:sz w:val="19"/>
-          <w:szCs w:val="19"/>
-        </w:rPr>
-        <w:t xml:space="preserve">  |  Python, pandas, NumPy, Matplotlib | 2026</w:t>
-      </w:r>
-    </w:p>
-    <w:p>
-      <w:pPr>
-        <w:pStyle w:val="ListParagraph"/>
-        <w:numPr>
-          <w:ilvl w:val="0"/>
-          <w:numId w:val="2"/>
-        </w:numPr>
-        <w:spacing w:after="40"/>
-      </w:pPr>
-      <w:r>
-        <w:rPr>
-          <w:rFonts w:ascii="Calibri" w:cs="Calibri" w:eastAsia="Calibri" w:hAnsi="Calibri"/>
-          <w:color w:val="222222"/>
-          <w:sz w:val="19"/>
-          <w:szCs w:val="19"/>
-        </w:rPr>
-        <w:t xml:space="preserve">Collected and cleaned a dataset of 215,000+ repositories, performing feature engineering and EDA at scale to support model-ready datasets.</w:t>
       </w:r>
     </w:p>
     <w:p>

</xml_diff>